<commit_message>
Wedding Venue EN revisión D174: entregables remontados, gates verdes, REVISION-FINAL y ERRATAS-ES
2 B · 5 M · 21 m. Tras la ronda: D15 VERDE, G1-G9 VERDE, barrido 0, censo 0, regresión 30/30 y 2.ª pasada con sha
canónico igual en los 5; Word en 25 páginas y contrato en 12. La calculadora no cambia.

Via: Claude Code
Co-Authored-By: Claude Opus 5.5 <noreply@anthropic.com>
</commit_message>
<xml_diff>
--- a/astro-site/public/dl/wedding-venue-business-plan/wedding-venue-business-plan.docx
+++ b/astro-site/public/dl/wedding-venue-business-plan/wedding-venue-business-plan.docx
@@ -315,7 +315,7 @@
     </w:p>
     <w:p>
       <w:r>
-        <w:t>This plan describes a wedding and event venue on a leased rural or semi-rural property with existing buildings: a barn or farmhouse, a garden, a hall that seats 200 guests and, as a rain plan, a pergola and a tent, plus a bridal suite, ADA-compliant restrooms, a gravel parking lot and a prep and warming kitchen for the caterer. You do not buy the property, you lease it, and the food and drinks come from an exclusive caterer who pays you a commission. You sell the venue rental fee and the event services, which make up 88% of sales ($538,560 in year 1). The caterer bills the menu and the bar directly to the couple, serves alcohol under its own license, and pays you a caterer commission (10% of its food and beverage sales at the venue, an assumption you negotiate) that makes up 12% of your sales: $73,440 in year 1. Interest is real: DataForSEO shows roughly 1,000 monthly US searches for "wedding venue business plan" and 720 for "event venue business plan". One warning up front: zoning approval, the conditional use permit and the certificate of occupancy decide whether there is a business at all, so check with your county before you spend anything.</w:t>
+        <w:t>This plan describes a wedding and event venue on a leased rural or semi-rural property with existing buildings: a barn or farmhouse, a garden, a hall that seats 200 guests, a pergola and, as a rain plan, a tent, plus a bridal suite, ADA-compliant restrooms, a gravel parking lot and a prep and warming kitchen for the caterer. You do not buy the property, you lease it, and the food and drinks come from an exclusive caterer who pays you a commission. You sell the venue rental fee and the event services, which make up 88% of sales ($538,560 in year 1). The caterer bills the menu and the bar directly to the couple, serves alcohol under its own license, and pays you a caterer commission (10% of its food and beverage sales at the venue, an assumption you negotiate) that makes up 12% of your sales: $73,440 in year 1. One warning up front: zoning approval, the conditional use permit and the certificate of occupancy decide whether there is a business at all, so check with your county before you spend anything.</w:t>
       </w:r>
     </w:p>
     <w:p>
@@ -362,7 +362,7 @@
     </w:p>
     <w:p>
       <w:r>
-        <w:t>The plan picks the exclusive caterer for three reasons. You do not need a production kitchen, which costs far more than a prep and warming kitchen, nor a kitchen crew. The food safety of the menu belongs to the caterer, not to you. And rental only gives up the commission: without the $73,440 of year 1, the venue loses a real share of its margin, and you should test that in the pessimistic scenario of the Excel. Buying the property is a different investment: it usually costs far more up front than leasing (typical range, get local quotes), and financing it with an SBA 504 loan is a variant to discuss with your lender and your CPA; the Excel does not model it. The plan leases a property with existing buildings, or one from a relative at market rent, at $5,000 a month (9.8% of sales). Negotiate a long lease whose term, counting extension options, is at least as long as the loan (SBA lenders typically require this; confirm with your lender), a purchase option or right of first refusal, the owner's written consent to the build-out and to using the lease as collateral, a tenant improvement (TI) allowance, reduced rent during the build-out and a lease contingent on CUP approval.</w:t>
+        <w:t>The plan picks the exclusive caterer for three reasons. You do not need a production kitchen, which costs far more than a prep and warming kitchen, nor a kitchen crew. The food safety of the menu belongs to the caterer, not to you. And rental only gives up the commission: without the $73,440 of year 1, the venue loses a real share of its margin, and you should test that in the Excel (section 8 explains how). Buying the property is a different investment: it usually costs far more up front than leasing (typical range, get local quotes), and financing it with an SBA 504 loan is a variant to discuss with your lender and your CPA; the Excel does not model it. The plan leases a property with existing buildings, or one from a relative at market rent, at $5,000 a month (9.8% of sales). Negotiate a long lease whose term, counting extension options that only you can exercise, is at least as long as the loan (SBA lenders typically require this; confirm with your lender), a purchase option or right of first refusal, the owner's written consent to the build-out and to using the lease as collateral, a tenant improvement (TI) allowance, reduced rent during the build-out and a lease contingent on CUP approval.</w:t>
       </w:r>
     </w:p>
     <w:p>
@@ -372,7 +372,7 @@
     </w:p>
     <w:p>
       <w:r>
-        <w:t>The day-to-day of an average event is measured with simple numbers. The venue team spends 9.2 hours on each event between setup, coordination, cleaning and parking, with 2.3 people on site at the same time, plus 12 hours of off-day work per event for tours, planning and turnover. The venue earns $6,120 on an average event, with 90 guests at $68.00 per guest excl. sales tax. All variable costs together take 16.6% of sales. It matters to look at the whole event and not just the price: growth in years 2 and 3 comes from more activity at the same revenue per guest, not from raising your rates.</w:t>
+        <w:t>The day-to-day of an average event is measured with simple numbers. The venue team spends 9.7 hours on each event between setup, coordination, cleaning and parking, with 2.4 people on site at the same time, plus 12 hours of off-day work per event for tours, planning and turnover. The venue earns $6,120 on an average event, with 90 guests at $68.00 per guest excl. sales tax. All variable costs together take 16.6% of sales. It matters to look at the whole event and not just the price: growth in years 2 and 3 comes from more activity at the same revenue per guest, not from raising your rates.</w:t>
       </w:r>
     </w:p>
     <w:p>
@@ -404,7 +404,7 @@
     </w:p>
     <w:p>
       <w:r>
-        <w:t>Couples usually book a wedding venue 12-18 months ahead (Kit estimate), ask several venues for information and tour a few, and most start online. That sets your calendar: dates are sold long before the event exists. Search demand is clear and it comes from clients, not only from entrepreneurs: DataForSEO shows roughly 6,600 monthly US searches for "wedding barn". Rates vary a lot by region, season and day of the week: published rate cards are a typical range, get local quotes, and treat them as advertised prices, not collected ones. The Excel and the pricing calculator give you the structure to set your own.</w:t>
+        <w:t>Couples usually book a wedding venue 12-18 months ahead (Kit estimate), ask several venues for information and tour a few, and most start online. That sets your calendar: dates are sold long before the event exists. Check the demand in your own area: a keyword tool such as Google Keyword Planner shows how many people around you search for terms like "wedding barn" or "wedding venues near me". Rates vary a lot by region, season and day of the week: published rate cards are a typical range, get local quotes, and treat them as advertised prices, not collected ones. The Excel and the pricing calculator give you the structure to set your own.</w:t>
       </w:r>
     </w:p>
     <w:p>
@@ -414,7 +414,7 @@
     </w:p>
     <w:p>
       <w:r>
-        <w:t>With Month 1 in March, the plan spreads sales with seasonality: the peak arrives with summer and early fall, and the trough with winter. The start has a 12-month ramp-up that begins well below full pace, because weddings are booked 12-18 months ahead. The lowest cash balance, $66,103, comes in month 2, just after the investment is paid and before the bulk of the season arrives: that first spring is carried by the $99,216 of working capital. After that, the season lifts the cash and carries you through the first winter, when rent and staff stay flat but few events are booked.</w:t>
+        <w:t>With Month 1 in March, the plan spreads sales with seasonality: the peaks arrive in June and in September-October, and the trough in January and February. The start has a 12-month ramp-up that begins well below full pace, because weddings are booked 12-18 months ahead. The lowest cash balance, $66,103, comes in month 2, just after the investment is paid and before the bulk of the season arrives: that first spring is carried by the $99,216 of working capital. After that, the season lifts the cash and carries you through the first winter, when rent and staff stay flat but few events are booked.</w:t>
       </w:r>
     </w:p>
     <w:p>
@@ -424,7 +424,7 @@
     </w:p>
     <w:p>
       <w:r>
-        <w:t>Demand has risks that the plan names. A price war over Saturday dates pushes rates down, clients may want to bring their own caterer, and a rainy spring demands that the hall and the tent rain plan be ready. The biggest risk is occupancy: below 84 events of the average size there is no cash in year 1, and from year 2, when you are repaying principal, the margin of safety over cash break-even is 27% and then 31%, so every date you do not sell shows.</w:t>
+        <w:t>Demand has risks that the plan names. A price war over Saturday dates pushes rates down, clients may want to bring their own caterer, and a rainy spring demands that the hall and the tent rain plan be ready. The biggest risk is occupancy: below 84 events of the average size there is no cash in year 1 (the loan payment, principal included, starts in year 1); the margin of safety over cash break-even then grows to 27% and 31%, but every date you do not sell shows.</w:t>
       </w:r>
     </w:p>
     <w:p>
@@ -466,7 +466,7 @@
     </w:p>
     <w:p>
       <w:r>
-        <w:t>Four factors decide whether it works. The first is the calendar: how many dates of the first season you book, contingent on the permits, while you process them and do the build-out. The second is the space: a setting that looks good in photos, with a hall and a tent for the rain plan and enough parking. The third is the exclusive caterer: a reliable partner, with a negotiated caterer commission that is easy to audit. The fourth is cash control: cash break-even is 84 events in year 1, with a margin of safety of 20%, and the margin changes to 27% and 31% in years 2 and 3 once you are repaying principal, so every date without a booking shows.</w:t>
+        <w:t>Four factors decide whether it works. The first is the calendar: how many dates of the first season you book, contingent on the permits, while you process them and do the build-out. The second is the space: a setting that looks good in photos, with a hall and a tent for the rain plan and enough parking. The third is the exclusive caterer: a reliable partner, with a negotiated caterer commission that is easy to audit. The fourth is cash control: cash break-even is 84 events in year 1, with a margin of safety of 20%, and the margin grows to 27% and 31% in years 2 and 3 with the loan payment already in from year 1, so every date without a booking shows.</w:t>
       </w:r>
     </w:p>
     <w:p>
@@ -550,7 +550,7 @@
     </w:p>
     <w:p>
       <w:r>
-        <w:t>Infrastructure is what separates a pretty venue from a venue that works. The case is sized for a hall that seats 200 guests, but the legal occupant load is set and posted by your fire marshal. ADA-compliant restrooms cost $45,000, with the septic upgrade quoted apart. Parking costs $35,000: plan about one space for every 2.5-3 guests. The standby generator ($15,000) covers a blackout in the middle of the reception, and the electrical service ($30,000) has to carry the caterer’s kitchen, the sound and the HVAC ($30,000). Sound and a decibel meter ($12,000) are planned from the start, so that the music stays in the hall. Add the caterer’s prep and warming kitchen ($25,000), where the caterer finishes and plates, and the fire sprinkler system ($70,000): sprinklers need city water, and a tank and fire pump, a new septic system or a strict county can double that line, so get local quotes. In the country there is usually no sewer, so you need a septic system sized for your guest count; ask your county health department and an engineer. These are startup items, not extras: if your budget does not include them, something is missing.</w:t>
+        <w:t>Infrastructure is what separates a pretty venue from a venue that works. The case is sized for a hall that seats 200 guests, but the legal occupant load is set and posted by your fire marshal. ADA-compliant restrooms cost $45,000, with the septic upgrade quoted apart. Parking costs $35,000: plan about one space for every 2.5-3 guests. The standby generator ($15,000) covers a blackout in the middle of the reception, and the electrical service ($30,000) has to carry the caterer’s kitchen, the sound and the HVAC ($30,000). Sound and a decibel meter ($12,000) are planned from the start, so that the music stays in the hall. Add the caterer’s prep and warming kitchen ($25,000), where the caterer finishes and plates, and the fire sprinkler system ($70,000): sprinklers need enough water flow and pressure, and without city water a tank and fire pump, a new septic system or a strict county can double that line, so get local quotes. In the country there is usually no sewer, so you need a septic system sized for your guest count; ask your county health department and an engineer. These are startup items, not extras: if your budget does not include them, something is missing.</w:t>
       </w:r>
     </w:p>
     <w:p>
@@ -592,7 +592,7 @@
     </w:p>
     <w:p>
       <w:r>
-        <w:t>That staff equals 3.70 full-time equivalents and costs $191,862 in year 1, or 31.4% of sales, including employer payroll taxes of 10%. It is the biggest expense of the business, ahead of the rent ($60,000 a year), so it is worth measuring well. Hours coverage is 119%, with 2.3 venue staff per event on average, not counting the caterer. If coverage falls short, you will feel it on a long setup Saturday; if there is a lot of slack, you pay for empty hours. Review it whenever you change the number of events or their size.</w:t>
+        <w:t>That staff equals 3.70 full-time equivalents and costs $191,862 in year 1, or 31.4% of sales, including employer payroll taxes of 10%. It is the biggest expense of the business, ahead of the rent ($60,000 a year), so it is worth measuring well. Hours coverage is 116%, with 2.4 venue staff per event on average, not counting the caterer. If coverage falls short, you will feel it on a long setup Saturday; if there is a lot of slack, you pay for empty hours. Review it whenever you change the number of events or their size.</w:t>
       </w:r>
     </w:p>
     <w:p>
@@ -654,7 +654,7 @@
     </w:p>
     <w:p>
       <w:r>
-        <w:t>The lowest DSCR is 1.86×, with 2.18× in the second year and 2.36× in the third: the business covers its debt, and your lender will want to see your pre-sold dates. A lender typically looks for a DSCR around 1.25× or higher, against the workbook limit of 1.15×. On payback: more than 3 years; that explains why the lease has to be long, with extension options: the build-out is depreciated over 15 years, so a short lease would sink the numbers. The example applies a 8% sales tax rate to venue rental and services and none to the caterer commission; confirm how your state treats each.</w:t>
+        <w:t>The lowest DSCR is 1.86×, with 2.18× in the second year and 2.36× in the third: the business covers its debt, and your lender will want to see your pre-sold dates. A lender typically looks for a DSCR around 1.25× or higher, against the workbook limit of 1.15×. On payback: more than 3 years; that explains why the lease has to be long, with extension options: the build-out is depreciated over 15 years, so a short lease would sink the numbers. The example applies a sales tax rate of 8% to venue rental and services and none to the caterer commission; confirm how your state treats each.</w:t>
       </w:r>
     </w:p>
     <w:p>
@@ -664,7 +664,7 @@
     </w:p>
     <w:p>
       <w:r>
-        <w:t>There are two reasoned alternatives, without Excel. With in-house catering the venue also bills the menu and the bar: sales multiply, but so do the investment, the kitchen crew and the food safety responsibility. It is a path for restaurant people, and the Catering Business Plan Kit covers it. With rental only, without the commission, the venue would sell $538,560 instead of $612,000, which leaves little cushion over the cash break-even revenue of $510,969; check it in the Excel by moving the sales mix. That is why the case carries the caterer commission. Buying the property with an SBA 504 loan is a third route to discuss with your lender and your CPA; the workbook does not model it.</w:t>
+        <w:t>There are two reasoned alternatives, without Excel. With in-house catering the venue also bills the menu and the bar: sales multiply, but so do the investment, the kitchen crew and the food safety responsibility. It is a path for restaurant people, and the Catering Business Plan Kit covers it. With rental only, without the commission, the venue would sell $538,560 instead of $612,000, which leaves little cushion over the cash break-even revenue of $510,969; check it in the Excel by setting the venue rental &amp; services share to 100% and lowering the revenue per guest by the commission's share. That is why the case carries the caterer commission. Buying the property with an SBA 504 loan is a third route to discuss with your lender and your CPA; the workbook does not model it.</w:t>
       </w:r>
     </w:p>
     <w:p>
@@ -686,7 +686,7 @@
     </w:p>
     <w:p>
       <w:r>
-        <w:t>The first thing that decides this business is not the market, but the land. In a zone where the local code already allows the use, you may only need the building permit and the certificate of occupancy. On rural land, where most barn venues are, you typically need zoning approval first: a conditional (special) use permit from your county, often with a public hearing and conditions such as a cap on events, hours, traffic and noise. Check with your county planning office; the rules vary by state and county. Do not confirm firm dates without the permits: before you have them, take only fully refundable holds contingent on them. Make the lease contingent on CUP approval, so it only starts if you get the zoning approval and the certificate of occupancy. Because the build-out is on land you do not own, negotiate a lease whose term, counting extension options, is at least the loan term (SBA lenders typically require this; confirm with your lender), plus a purchase option or right of first refusal, the owner’s consent to the build-out and to using the lease as collateral, and a tenant improvement (TI) allowance. Form an LLC with an EIN and ask your state and county which licenses and sales tax permit you need.</w:t>
+        <w:t>The first thing that decides this business is not the market, but the land. In a zone where the local code already allows the use, you may only need the building permit and the certificate of occupancy. On rural land, where most barn venues are, you typically need zoning approval first: a conditional (special) use permit from your county, often with a public hearing and conditions such as a cap on events, hours, traffic and noise. Check with your county planning office; the rules vary by state and county. Do not confirm firm dates without the permits: before you have them, take only fully refundable holds contingent on them. Make the lease contingent on CUP approval, so it only starts if you get the zoning approval and the certificate of occupancy. Because the build-out is on land you do not own, negotiate a lease whose term, counting extension options that only you can exercise, is at least the loan term (SBA lenders typically require this; confirm with your lender), plus a purchase option or right of first refusal, the owner’s consent to the build-out and to using the lease as collateral, and a tenant improvement (TI) allowance. Form an LLC with an EIN and ask your state and county which licenses and sales tax permit you need.</w:t>
       </w:r>
     </w:p>
     <w:p>
@@ -696,7 +696,7 @@
     </w:p>
     <w:p>
       <w:r>
-        <w:t>The Americans with Disabilities Act (Title III) treats a venue that is open to the public as a public accommodation, with accessible routes, restrooms and parking. Do not assume an old building is exempt: ask your architect and your attorney what applies to your property. Water and sanitation matter in the country: a commercial septic system must be sized for your guest count, so ask your county health department and an engineer for the calculation. If a well serves your guests, ask your state drinking water program whether the well counts as a public water system, and what testing and permit you need before the first event.</w:t>
+        <w:t>The Americans with Disabilities Act (Title III) treats a venue that is open to the public as a public accommodation, with accessible routes, restrooms and parking. Do not assume an old building is exempt: ask your architect and your attorney what applies to your property. Water and sanitation matter in the country: a commercial septic system must be sized for your guest count, so ask your county health department and an engineer for the calculation. If a well serves your guests, it may count as a public water system: under the federal definition (40 CFR 141.2), one that regularly serves an average of at least 25 people a day at least 60 days a year. Ask your state drinking water program whether yours does, and what testing and permit you need before the first event.</w:t>
       </w:r>
     </w:p>
     <w:p>
@@ -753,7 +753,7 @@
     </w:p>
     <w:p>
       <w:r>
-        <w:t>The sixth risk is buying the property: it is a seven-figure investment that this plan does not need; if you want to explore it, ask your lender about an SBA 504 loan. Lease a property with the buildings already built. The seventh is leasing it for too short a time: depreciating the build-out over a short lease sinks the numbers, which is why the lease needs extension options that bring it at least to the loan term, with reduced rent during the build-out and the owner’s consent to the improvements. The eighth is living only on peak Saturdays, with rent and staff flat all year: the busy season is concentrated, and the winter eats the cash of the season if there are no corporate events and private celebrations to fill it.</w:t>
+        <w:t>The sixth risk is buying the property: it is often a seven-figure investment that this plan does not need; if you want to explore it, ask your lender about an SBA 504 loan. Lease a property with the buildings already built. The seventh is leasing it for too short a time: depreciating the build-out over a short lease sinks the numbers, which is why the lease needs extension options that bring it at least to the loan term, with reduced rent during the build-out and the owner’s consent to the improvements. The eighth is living only on peak Saturdays, with rent and staff flat all year: the busy season is concentrated, and the winter eats the cash of the season if there are no corporate events and private celebrations to fill it.</w:t>
       </w:r>
     </w:p>
     <w:p>

</xml_diff>